<commit_message>
docs(commercial): freeze service proposal
</commit_message>
<xml_diff>
--- a/docs/qms/01_bloque_general/02_procedimientos/P-PSEA-17 Quejas del PEA.docx
+++ b/docs/qms/01_bloque_general/02_procedimientos/P-PSEA-17 Quejas del PEA.docx
@@ -2,13 +2,13 @@
 <file path=word/document.xml><?xml version="1.0" encoding="utf-8"?>
 <w:document xmlns:w="http://schemas.openxmlformats.org/wordprocessingml/2006/main" xmlns:m="http://schemas.openxmlformats.org/officeDocument/2006/math" xmlns:r="http://schemas.openxmlformats.org/officeDocument/2006/relationships" xmlns:o="urn:schemas-microsoft-com:office:office" xmlns:v="urn:schemas-microsoft-com:vml" xmlns:w10="urn:schemas-microsoft-com:office:word" xmlns:a="http://schemas.openxmlformats.org/drawingml/2006/main" xmlns:pic="http://schemas.openxmlformats.org/drawingml/2006/picture" xmlns:wp="http://schemas.openxmlformats.org/drawingml/2006/wordprocessingDrawing">
   <w:body>
-    <w:bookmarkStart w:id="15" w:name="p-psea-17-auditorías-internas-del-pea"/>
+    <w:bookmarkStart w:id="25" w:name="p-psea-17-quejas-del-pea"/>
     <w:p>
       <w:pPr>
         <w:pStyle w:val="Heading1"/>
       </w:pPr>
       <w:r>
-        <w:t xml:space="preserve">P-PSEA-17 — Auditorías Internas del PEA</w:t>
+        <w:t xml:space="preserve">P-PSEA-17: Quejas del PEA</w:t>
       </w:r>
     </w:p>
     <w:p>
@@ -20,7 +20,7 @@
           <w:b/>
           <w:bCs/>
         </w:rPr>
-        <w:t xml:space="preserve">Código:</w:t>
+        <w:t xml:space="preserve">Codigo:</w:t>
       </w:r>
       <w:r>
         <w:t xml:space="preserve"> </w:t>
@@ -36,13 +36,61 @@
           <w:b/>
           <w:bCs/>
         </w:rPr>
-        <w:t xml:space="preserve">Nivel:</w:t>
+        <w:t xml:space="preserve">Tipo documental:</w:t>
       </w:r>
       <w:r>
         <w:t xml:space="preserve"> </w:t>
       </w:r>
       <w:r>
-        <w:t xml:space="preserve">2 — Procedimiento del Sistema de Gestión</w:t>
+        <w:t xml:space="preserve">Procedimiento de gestion</w:t>
+      </w:r>
+      <w:r>
+        <w:br/>
+      </w:r>
+      <w:r>
+        <w:rPr>
+          <w:b/>
+          <w:bCs/>
+        </w:rPr>
+        <w:t xml:space="preserve">Nombre:</w:t>
+      </w:r>
+      <w:r>
+        <w:t xml:space="preserve"> </w:t>
+      </w:r>
+      <w:r>
+        <w:t xml:space="preserve">Quejas del PEA</w:t>
+      </w:r>
+      <w:r>
+        <w:br/>
+      </w:r>
+      <w:r>
+        <w:rPr>
+          <w:b/>
+          <w:bCs/>
+        </w:rPr>
+        <w:t xml:space="preserve">Version:</w:t>
+      </w:r>
+      <w:r>
+        <w:t xml:space="preserve"> </w:t>
+      </w:r>
+      <w:r>
+        <w:t xml:space="preserve">1.0</w:t>
+      </w:r>
+      <w:r>
+        <w:br/>
+      </w:r>
+      <w:r>
+        <w:rPr>
+          <w:b/>
+          <w:bCs/>
+        </w:rPr>
+        <w:t xml:space="preserve">Fecha:</w:t>
+      </w:r>
+      <w:r>
+        <w:t xml:space="preserve"> </w:t>
+      </w:r>
+      <w:r>
+        <w:t xml:space="preserve">2026-07-14</w:t>
       </w:r>
       <w:r>
         <w:br/>
@@ -58,7 +106,7 @@
         <w:t xml:space="preserve"> </w:t>
       </w:r>
       <w:r>
-        <w:t xml:space="preserve">placeholder</w:t>
+        <w:t xml:space="preserve">Preliminar - Revisar</w:t>
       </w:r>
       <w:r>
         <w:br/>
@@ -68,45 +116,13 @@
           <w:b/>
           <w:bCs/>
         </w:rPr>
-        <w:t xml:space="preserve">Cláusulas ISO/IEC 17043:2023:</w:t>
+        <w:t xml:space="preserve">Clase:</w:t>
       </w:r>
       <w:r>
         <w:t xml:space="preserve"> </w:t>
       </w:r>
       <w:r>
-        <w:t xml:space="preserve">8.8</w:t>
-      </w:r>
-      <w:r>
-        <w:br/>
-      </w:r>
-      <w:r>
-        <w:rPr>
-          <w:b/>
-          <w:bCs/>
-        </w:rPr>
-        <w:t xml:space="preserve">Oleada:</w:t>
-      </w:r>
-      <w:r>
-        <w:t xml:space="preserve"> </w:t>
-      </w:r>
-      <w:r>
-        <w:t xml:space="preserve">3</w:t>
-      </w:r>
-      <w:r>
-        <w:br/>
-      </w:r>
-      <w:r>
-        <w:rPr>
-          <w:b/>
-          <w:bCs/>
-        </w:rPr>
-        <w:t xml:space="preserve">Prioridad:</w:t>
-      </w:r>
-      <w:r>
-        <w:t xml:space="preserve"> </w:t>
-      </w:r>
-      <w:r>
-        <w:t xml:space="preserve">Oleada 3 (gobernanza)</w:t>
+        <w:t xml:space="preserve">Procedimiento activo segun mapa de navegacion SGC PEA</w:t>
       </w:r>
     </w:p>
     <w:p>
@@ -116,13 +132,13 @@
         </w:pict>
       </w:r>
     </w:p>
-    <w:bookmarkStart w:id="11" w:name="descripción"/>
+    <w:bookmarkStart w:id="11" w:name="objetivo"/>
     <w:p>
       <w:pPr>
         <w:pStyle w:val="Heading2"/>
       </w:pPr>
       <w:r>
-        <w:t xml:space="preserve">Descripción</w:t>
+        <w:t xml:space="preserve">1. Objetivo</w:t>
       </w:r>
     </w:p>
     <w:p>
@@ -130,17 +146,25 @@
         <w:pStyle w:val="FirstParagraph"/>
       </w:pPr>
       <w:r>
-        <w:t xml:space="preserve">Procedimiento para planificar, ejecutar y documentar auditorías internas del SGC del PEA. Define el programa de auditoría, criterios de selección de auditores (competencia, independencia), planificación por ronda, ejecución de la auditoría, informes de hallazgos y seguimiento de acciones correctivas derivadas. La auditoría debe cubrir todos los requisitos de ISO/IEC 17043:2023 aplicables al esquema.</w:t>
+        <w:t xml:space="preserve">Definir la recepcion, validacion, evaluacion, investigacion, respuesta y cierre de las quejas relacionadas con las actividades del PEA, garantizando imparcialidad, confidencialidad, trazabilidad y tratamiento oportuno.</w:t>
       </w:r>
     </w:p>
     <w:bookmarkEnd w:id="11"/>
-    <w:bookmarkStart w:id="12" w:name="contenido-esperado"/>
+    <w:bookmarkStart w:id="12" w:name="alcance"/>
     <w:p>
       <w:pPr>
         <w:pStyle w:val="Heading2"/>
       </w:pPr>
       <w:r>
-        <w:t xml:space="preserve">Contenido esperado</w:t>
+        <w:t xml:space="preserve">2. Alcance</w:t>
+      </w:r>
+    </w:p>
+    <w:p>
+      <w:pPr>
+        <w:pStyle w:val="FirstParagraph"/>
+      </w:pPr>
+      <w:r>
+        <w:t xml:space="preserve">Este procedimiento aplica a quejas presentadas por participantes u otras partes interesadas sobre:</w:t>
       </w:r>
     </w:p>
     <w:p>
@@ -152,7 +176,7 @@
         </w:numPr>
       </w:pPr>
       <w:r>
-        <w:t xml:space="preserve">Programa anual de auditorías internas</w:t>
+        <w:t xml:space="preserve">La prestacion del servicio del PEA.</w:t>
       </w:r>
     </w:p>
     <w:p>
@@ -164,7 +188,7 @@
         </w:numPr>
       </w:pPr>
       <w:r>
-        <w:t xml:space="preserve">Criterios de selección y competencia de auditores</w:t>
+        <w:t xml:space="preserve">La actuacion del personal o de proveedores que intervienen en el esquema.</w:t>
       </w:r>
     </w:p>
     <w:p>
@@ -176,7 +200,7 @@
         </w:numPr>
       </w:pPr>
       <w:r>
-        <w:t xml:space="preserve">Planificación de cada auditoría</w:t>
+        <w:t xml:space="preserve">Las comunicaciones, plazos o atencion recibida.</w:t>
       </w:r>
     </w:p>
     <w:p>
@@ -188,7 +212,7 @@
         </w:numPr>
       </w:pPr>
       <w:r>
-        <w:t xml:space="preserve">Ejecución y recopilación de evidencias</w:t>
+        <w:t xml:space="preserve">La preparacion, distribucion o manejo de los items de ensayo.</w:t>
       </w:r>
     </w:p>
     <w:p>
@@ -200,7 +224,7 @@
         </w:numPr>
       </w:pPr>
       <w:r>
-        <w:t xml:space="preserve">Informe de auditoría (hallazgos, NC, observaciones)</w:t>
+        <w:t xml:space="preserve">La operacion de las plataformas y los canales dispuestos por el PEA.</w:t>
       </w:r>
     </w:p>
     <w:p>
@@ -212,29 +236,15 @@
         </w:numPr>
       </w:pPr>
       <w:r>
-        <w:t xml:space="preserve">Seguimiento de acciones correctivas</w:t>
-      </w:r>
-    </w:p>
-    <w:p>
-      <w:pPr>
-        <w:pStyle w:val="Compact"/>
-        <w:numPr>
-          <w:ilvl w:val="0"/>
-          <w:numId w:val="1001"/>
-        </w:numPr>
-      </w:pPr>
-      <w:r>
-        <w:t xml:space="preserve">Formato asociado: F-PSEA-19 (Lista de Verificación Auditoría Interna)</w:t>
-      </w:r>
-    </w:p>
-    <w:bookmarkEnd w:id="12"/>
-    <w:bookmarkStart w:id="13" w:name="dependencias"/>
-    <w:p>
-      <w:pPr>
-        <w:pStyle w:val="Heading2"/>
-      </w:pPr>
-      <w:r>
-        <w:t xml:space="preserve">Dependencias</w:t>
+        <w:t xml:space="preserve">Cualquier actividad del PEA que pueda afectar el cumplimiento de sus requisitos.</w:t>
+      </w:r>
+    </w:p>
+    <w:p>
+      <w:pPr>
+        <w:pStyle w:val="FirstParagraph"/>
+      </w:pPr>
+      <w:r>
+        <w:t xml:space="preserve">No aplica a:</w:t>
       </w:r>
     </w:p>
     <w:p>
@@ -246,7 +256,34 @@
         </w:numPr>
       </w:pPr>
       <w:r>
-        <w:t xml:space="preserve">DG-PSEA-01</w:t>
+        <w:t xml:space="preserve">Apelaciones contra resultados o decisiones del PEA, gestionadas mediante</w:t>
+      </w:r>
+      <w:r>
+        <w:t xml:space="preserve"> </w:t>
+      </w:r>
+      <w:r>
+        <w:rPr>
+          <w:rStyle w:val="VerbatimChar"/>
+        </w:rPr>
+        <w:t xml:space="preserve">P-PSEA-18</w:t>
+      </w:r>
+      <w:r>
+        <w:t xml:space="preserve"> </w:t>
+      </w:r>
+      <w:r>
+        <w:t xml:space="preserve">y</w:t>
+      </w:r>
+      <w:r>
+        <w:t xml:space="preserve"> </w:t>
+      </w:r>
+      <w:r>
+        <w:rPr>
+          <w:rStyle w:val="VerbatimChar"/>
+        </w:rPr>
+        <w:t xml:space="preserve">F-PSEA-15</w:t>
+      </w:r>
+      <w:r>
+        <w:t xml:space="preserve">.</w:t>
       </w:r>
     </w:p>
     <w:p>
@@ -258,30 +295,84 @@
         </w:numPr>
       </w:pPr>
       <w:r>
-        <w:t xml:space="preserve">Relacionado con P-PSEA-16, P-PSEA-18</w:t>
-      </w:r>
-    </w:p>
-    <w:p>
-      <w:r>
-        <w:pict>
-          <v:rect style="width:0;height:1.5pt" o:hralign="center" o:hrstd="t" o:hr="t"/>
-        </w:pict>
-      </w:r>
-    </w:p>
-    <w:bookmarkEnd w:id="13"/>
-    <w:bookmarkStart w:id="14" w:name="trazabilidad-normativa"/>
+        <w:t xml:space="preserve">Solicitudes ordinarias de informacion o aclaracion, gestionadas mediante</w:t>
+      </w:r>
+      <w:r>
+        <w:t xml:space="preserve"> </w:t>
+      </w:r>
+      <w:r>
+        <w:rPr>
+          <w:rStyle w:val="VerbatimChar"/>
+        </w:rPr>
+        <w:t xml:space="preserve">P-PSEA-05</w:t>
+      </w:r>
+      <w:r>
+        <w:t xml:space="preserve">.</w:t>
+      </w:r>
+    </w:p>
+    <w:p>
+      <w:pPr>
+        <w:pStyle w:val="Compact"/>
+        <w:numPr>
+          <w:ilvl w:val="0"/>
+          <w:numId w:val="1002"/>
+        </w:numPr>
+      </w:pPr>
+      <w:r>
+        <w:t xml:space="preserve">Trabajo no conforme, no conformidades o acciones correctivas que no se originen en una queja, gestionados mediante</w:t>
+      </w:r>
+      <w:r>
+        <w:t xml:space="preserve"> </w:t>
+      </w:r>
+      <w:r>
+        <w:rPr>
+          <w:rStyle w:val="VerbatimChar"/>
+        </w:rPr>
+        <w:t xml:space="preserve">P-PSEA-15</w:t>
+      </w:r>
+      <w:r>
+        <w:t xml:space="preserve">.</w:t>
+      </w:r>
+    </w:p>
+    <w:p>
+      <w:pPr>
+        <w:pStyle w:val="Compact"/>
+        <w:numPr>
+          <w:ilvl w:val="0"/>
+          <w:numId w:val="1002"/>
+        </w:numPr>
+      </w:pPr>
+      <w:r>
+        <w:t xml:space="preserve">Sospechas de colusion o falsificacion, gestionadas mediante</w:t>
+      </w:r>
+      <w:r>
+        <w:t xml:space="preserve"> </w:t>
+      </w:r>
+      <w:r>
+        <w:rPr>
+          <w:rStyle w:val="VerbatimChar"/>
+        </w:rPr>
+        <w:t xml:space="preserve">P-PSEA-14</w:t>
+      </w:r>
+      <w:r>
+        <w:t xml:space="preserve">.</w:t>
+      </w:r>
+    </w:p>
+    <w:bookmarkEnd w:id="12"/>
+    <w:bookmarkStart w:id="13" w:name="responsables"/>
     <w:p>
       <w:pPr>
         <w:pStyle w:val="Heading2"/>
       </w:pPr>
       <w:r>
-        <w:t xml:space="preserve">Trazabilidad Normativa</w:t>
+        <w:t xml:space="preserve">3. Responsables</w:t>
       </w:r>
     </w:p>
     <w:tbl>
       <w:tblPr>
         <w:tblStyle w:val="Table"/>
-        <w:tblW w:type="auto" w:w="0"/>
+        <w:tblW w:type="pct" w:w="5000"/>
+        <w:tblLayout w:type="fixed"/>
         <w:tblLook w:firstRow="1" w:lastRow="0" w:firstColumn="0" w:lastColumn="0" w:noHBand="0" w:noVBand="0" w:val="0020"/>
       </w:tblPr>
       <w:tblGrid>
@@ -299,18 +390,18 @@
               <w:pStyle w:val="Compact"/>
             </w:pPr>
             <w:r>
-              <w:t xml:space="preserve">Norma</w:t>
-            </w:r>
-          </w:p>
-        </w:tc>
-        <w:tc>
-          <w:tcPr/>
-          <w:p>
-            <w:pPr>
-              <w:pStyle w:val="Compact"/>
-            </w:pPr>
-            <w:r>
-              <w:t xml:space="preserve">Cláusula(s)</w:t>
+              <w:t xml:space="preserve">Rol</w:t>
+            </w:r>
+          </w:p>
+        </w:tc>
+        <w:tc>
+          <w:tcPr/>
+          <w:p>
+            <w:pPr>
+              <w:pStyle w:val="Compact"/>
+            </w:pPr>
+            <w:r>
+              <w:t xml:space="preserve">Responsabilidad</w:t>
             </w:r>
           </w:p>
         </w:tc>
@@ -323,18 +414,18 @@
               <w:pStyle w:val="Compact"/>
             </w:pPr>
             <w:r>
-              <w:t xml:space="preserve">ISO/IEC 17043:2023</w:t>
-            </w:r>
-          </w:p>
-        </w:tc>
-        <w:tc>
-          <w:tcPr/>
-          <w:p>
-            <w:pPr>
-              <w:pStyle w:val="Compact"/>
-            </w:pPr>
-            <w:r>
-              <w:t xml:space="preserve">8.8</w:t>
+              <w:t xml:space="preserve">Parte interesada</w:t>
+            </w:r>
+          </w:p>
+        </w:tc>
+        <w:tc>
+          <w:tcPr/>
+          <w:p>
+            <w:pPr>
+              <w:pStyle w:val="Compact"/>
+            </w:pPr>
+            <w:r>
+              <w:t xml:space="preserve">Presentar la queja por un canal autorizado y aportar la informacion disponible.</w:t>
             </w:r>
           </w:p>
         </w:tc>
@@ -347,18 +438,114 @@
               <w:pStyle w:val="Compact"/>
             </w:pPr>
             <w:r>
-              <w:t xml:space="preserve">ISO 13528:2022</w:t>
-            </w:r>
-          </w:p>
-        </w:tc>
-        <w:tc>
-          <w:tcPr/>
-          <w:p>
-            <w:pPr>
-              <w:pStyle w:val="Compact"/>
-            </w:pPr>
-            <w:r>
-              <w:t xml:space="preserve">—</w:t>
+              <w:t xml:space="preserve">Recepcionista oficial del PEA</w:t>
+            </w:r>
+          </w:p>
+        </w:tc>
+        <w:tc>
+          <w:tcPr/>
+          <w:p>
+            <w:pPr>
+              <w:pStyle w:val="Compact"/>
+            </w:pPr>
+            <w:r>
+              <w:t xml:space="preserve">Recibir la queja, confirmar su recepcion y asegurar su registro.</w:t>
+            </w:r>
+          </w:p>
+        </w:tc>
+      </w:tr>
+      <w:tr>
+        <w:tc>
+          <w:tcPr/>
+          <w:p>
+            <w:pPr>
+              <w:pStyle w:val="Compact"/>
+            </w:pPr>
+            <w:r>
+              <w:t xml:space="preserve">Responsable de calidad</w:t>
+            </w:r>
+          </w:p>
+        </w:tc>
+        <w:tc>
+          <w:tcPr/>
+          <w:p>
+            <w:pPr>
+              <w:pStyle w:val="Compact"/>
+            </w:pPr>
+            <w:r>
+              <w:t xml:space="preserve">Validar la clasificacion, designar al responsable del caso y supervisar su tratamiento.</w:t>
+            </w:r>
+          </w:p>
+        </w:tc>
+      </w:tr>
+      <w:tr>
+        <w:tc>
+          <w:tcPr/>
+          <w:p>
+            <w:pPr>
+              <w:pStyle w:val="Compact"/>
+            </w:pPr>
+            <w:r>
+              <w:t xml:space="preserve">Responsable del caso SGC</w:t>
+            </w:r>
+          </w:p>
+        </w:tc>
+        <w:tc>
+          <w:tcPr/>
+          <w:p>
+            <w:pPr>
+              <w:pStyle w:val="Compact"/>
+            </w:pPr>
+            <w:r>
+              <w:t xml:space="preserve">Investigar la queja, recopilar evidencias, proponer la respuesta y mantener actualizado el registro.</w:t>
+            </w:r>
+          </w:p>
+        </w:tc>
+      </w:tr>
+      <w:tr>
+        <w:tc>
+          <w:tcPr/>
+          <w:p>
+            <w:pPr>
+              <w:pStyle w:val="Compact"/>
+            </w:pPr>
+            <w:r>
+              <w:t xml:space="preserve">Responsable de decision</w:t>
+            </w:r>
+          </w:p>
+        </w:tc>
+        <w:tc>
+          <w:tcPr/>
+          <w:p>
+            <w:pPr>
+              <w:pStyle w:val="Compact"/>
+            </w:pPr>
+            <w:r>
+              <w:t xml:space="preserve">Revisar la evaluacion y aprobar la decision y la respuesta al reclamante.</w:t>
+            </w:r>
+          </w:p>
+        </w:tc>
+      </w:tr>
+      <w:tr>
+        <w:tc>
+          <w:tcPr/>
+          <w:p>
+            <w:pPr>
+              <w:pStyle w:val="Compact"/>
+            </w:pPr>
+            <w:r>
+              <w:t xml:space="preserve">Alta direccion del PEA</w:t>
+            </w:r>
+          </w:p>
+        </w:tc>
+        <w:tc>
+          <w:tcPr/>
+          <w:p>
+            <w:pPr>
+              <w:pStyle w:val="Compact"/>
+            </w:pPr>
+            <w:r>
+              <w:t xml:space="preserve">Resolver conflictos de interes y casos que comprometan la imparcialidad, la validez del esquema o su reputacion.</w:t>
             </w:r>
           </w:p>
         </w:tc>
@@ -369,25 +556,34 @@
         <w:pStyle w:val="BodyText"/>
       </w:pPr>
       <w:r>
-        <w:rPr>
-          <w:b/>
-          <w:bCs/>
-        </w:rPr>
-        <w:t xml:space="preserve">Justificación:</w:t>
-      </w:r>
-      <w:r>
-        <w:t xml:space="preserve"> </w:t>
-      </w:r>
-      <w:r>
-        <w:t xml:space="preserve">Programa, competencia de auditores, informe, seguimiento</w:t>
-      </w:r>
-    </w:p>
-    <w:p>
-      <w:pPr>
-        <w:pStyle w:val="BlockText"/>
-      </w:pPr>
-      <w:r>
-        <w:t xml:space="preserve">Fuente:</w:t>
+        <w:t xml:space="preserve">Quienes hayan participado directamente en la actividad objeto de la queja no deben aprobar su evaluacion ni su decision. Cuando no sea posible asegurar independencia interna, el responsable de calidad debe designar una persona competente que no esté involucrada en el asunto y documentar la medida adoptada.</w:t>
+      </w:r>
+    </w:p>
+    <w:bookmarkEnd w:id="13"/>
+    <w:bookmarkStart w:id="20" w:name="desarrollo"/>
+    <w:p>
+      <w:pPr>
+        <w:pStyle w:val="Heading2"/>
+      </w:pPr>
+      <w:r>
+        <w:t xml:space="preserve">4. Desarrollo</w:t>
+      </w:r>
+    </w:p>
+    <w:bookmarkStart w:id="14" w:name="recepcion-y-acuse"/>
+    <w:p>
+      <w:pPr>
+        <w:pStyle w:val="Heading3"/>
+      </w:pPr>
+      <w:r>
+        <w:t xml:space="preserve">4.1 Recepcion y acuse</w:t>
+      </w:r>
+    </w:p>
+    <w:p>
+      <w:pPr>
+        <w:pStyle w:val="FirstParagraph"/>
+      </w:pPr>
+      <w:r>
+        <w:t xml:space="preserve">La queja debe recibirse por correo electronico institucional u otro canal formal definido en</w:t>
       </w:r>
       <w:r>
         <w:t xml:space="preserve"> </w:t>
@@ -396,11 +592,1213 @@
         <w:rPr>
           <w:rStyle w:val="VerbatimChar"/>
         </w:rPr>
-        <w:t xml:space="preserve">trazabilidad_normativa_sgc.md</w:t>
+        <w:t xml:space="preserve">P-PSEA-05</w:t>
+      </w:r>
+      <w:r>
+        <w:t xml:space="preserve">. Al recibirla, el PEA debe:</w:t>
+      </w:r>
+    </w:p>
+    <w:p>
+      <w:pPr>
+        <w:pStyle w:val="Compact"/>
+        <w:numPr>
+          <w:ilvl w:val="0"/>
+          <w:numId w:val="1003"/>
+        </w:numPr>
+      </w:pPr>
+      <w:r>
+        <w:t xml:space="preserve">Registrar la fecha, el canal, el reclamante, la descripcion y la ronda afectada, cuando aplique.</w:t>
+      </w:r>
+    </w:p>
+    <w:p>
+      <w:pPr>
+        <w:pStyle w:val="Compact"/>
+        <w:numPr>
+          <w:ilvl w:val="0"/>
+          <w:numId w:val="1003"/>
+        </w:numPr>
+      </w:pPr>
+      <w:r>
+        <w:t xml:space="preserve">Asignar un identificador unico en</w:t>
+      </w:r>
+      <w:r>
+        <w:t xml:space="preserve"> </w:t>
+      </w:r>
+      <w:r>
+        <w:rPr>
+          <w:rStyle w:val="VerbatimChar"/>
+        </w:rPr>
+        <w:t xml:space="preserve">F-PSEA-14</w:t>
+      </w:r>
+      <w:r>
+        <w:t xml:space="preserve"> </w:t>
+      </w:r>
+      <w:r>
+        <w:t xml:space="preserve">o en el modulo de casos SGC de</w:t>
+      </w:r>
+      <w:r>
+        <w:t xml:space="preserve"> </w:t>
+      </w:r>
+      <w:r>
+        <w:rPr>
+          <w:rStyle w:val="VerbatimChar"/>
+        </w:rPr>
+        <w:t xml:space="preserve">calaire-app</w:t>
+      </w:r>
+      <w:r>
+        <w:t xml:space="preserve">.</w:t>
+      </w:r>
+    </w:p>
+    <w:p>
+      <w:pPr>
+        <w:pStyle w:val="Compact"/>
+        <w:numPr>
+          <w:ilvl w:val="0"/>
+          <w:numId w:val="1003"/>
+        </w:numPr>
+      </w:pPr>
+      <w:r>
+        <w:t xml:space="preserve">Confirmar la recepcion al reclamante e informar el canal de seguimiento.</w:t>
+      </w:r>
+    </w:p>
+    <w:p>
+      <w:pPr>
+        <w:pStyle w:val="Compact"/>
+        <w:numPr>
+          <w:ilvl w:val="0"/>
+          <w:numId w:val="1003"/>
+        </w:numPr>
+      </w:pPr>
+      <w:r>
+        <w:t xml:space="preserve">Proteger la identidad y la informacion sensible conforme a</w:t>
+      </w:r>
+      <w:r>
+        <w:t xml:space="preserve"> </w:t>
+      </w:r>
+      <w:r>
+        <w:rPr>
+          <w:rStyle w:val="VerbatimChar"/>
+        </w:rPr>
+        <w:t xml:space="preserve">P-PSEA-19</w:t>
+      </w:r>
+      <w:r>
+        <w:t xml:space="preserve">.</w:t>
+      </w:r>
+    </w:p>
+    <w:p>
+      <w:pPr>
+        <w:pStyle w:val="FirstParagraph"/>
+      </w:pPr>
+      <w:r>
+        <w:t xml:space="preserve">Las quejas verbales deben documentarse y confirmarse por un canal formal antes de iniciar su evaluacion, siempre que sea posible.</w:t>
       </w:r>
     </w:p>
     <w:bookmarkEnd w:id="14"/>
+    <w:bookmarkStart w:id="15" w:name="validacion-y-clasificacion"/>
+    <w:p>
+      <w:pPr>
+        <w:pStyle w:val="Heading3"/>
+      </w:pPr>
+      <w:r>
+        <w:t xml:space="preserve">4.2 Validacion y clasificacion</w:t>
+      </w:r>
+    </w:p>
+    <w:p>
+      <w:pPr>
+        <w:pStyle w:val="FirstParagraph"/>
+      </w:pPr>
+      <w:r>
+        <w:t xml:space="preserve">El responsable de calidad verifica que la comunicacion se relacione con actividades bajo responsabilidad del PEA y que exista informacion suficiente para su tratamiento.</w:t>
+      </w:r>
+    </w:p>
+    <w:p>
+      <w:pPr>
+        <w:pStyle w:val="BodyText"/>
+      </w:pPr>
+      <w:r>
+        <w:t xml:space="preserve">El caso debe clasificarse como:</w:t>
+      </w:r>
+    </w:p>
+    <w:p>
+      <w:pPr>
+        <w:pStyle w:val="Compact"/>
+        <w:numPr>
+          <w:ilvl w:val="0"/>
+          <w:numId w:val="1004"/>
+        </w:numPr>
+      </w:pPr>
+      <w:r>
+        <w:t xml:space="preserve">Queja admisible.</w:t>
+      </w:r>
+    </w:p>
+    <w:p>
+      <w:pPr>
+        <w:pStyle w:val="Compact"/>
+        <w:numPr>
+          <w:ilvl w:val="0"/>
+          <w:numId w:val="1004"/>
+        </w:numPr>
+      </w:pPr>
+      <w:r>
+        <w:t xml:space="preserve">Queja no admisible, con justificacion documentada.</w:t>
+      </w:r>
+    </w:p>
+    <w:p>
+      <w:pPr>
+        <w:pStyle w:val="Compact"/>
+        <w:numPr>
+          <w:ilvl w:val="0"/>
+          <w:numId w:val="1004"/>
+        </w:numPr>
+      </w:pPr>
+      <w:r>
+        <w:t xml:space="preserve">Apelacion, para traslado a</w:t>
+      </w:r>
+      <w:r>
+        <w:t xml:space="preserve"> </w:t>
+      </w:r>
+      <w:r>
+        <w:rPr>
+          <w:rStyle w:val="VerbatimChar"/>
+        </w:rPr>
+        <w:t xml:space="preserve">P-PSEA-18</w:t>
+      </w:r>
+      <w:r>
+        <w:t xml:space="preserve">.</w:t>
+      </w:r>
+    </w:p>
+    <w:p>
+      <w:pPr>
+        <w:pStyle w:val="Compact"/>
+        <w:numPr>
+          <w:ilvl w:val="0"/>
+          <w:numId w:val="1004"/>
+        </w:numPr>
+      </w:pPr>
+      <w:r>
+        <w:t xml:space="preserve">Solicitud de informacion o aclaracion, para traslado a</w:t>
+      </w:r>
+      <w:r>
+        <w:t xml:space="preserve"> </w:t>
+      </w:r>
+      <w:r>
+        <w:rPr>
+          <w:rStyle w:val="VerbatimChar"/>
+        </w:rPr>
+        <w:t xml:space="preserve">P-PSEA-05</w:t>
+      </w:r>
+      <w:r>
+        <w:t xml:space="preserve">.</w:t>
+      </w:r>
+    </w:p>
+    <w:p>
+      <w:pPr>
+        <w:pStyle w:val="Compact"/>
+        <w:numPr>
+          <w:ilvl w:val="0"/>
+          <w:numId w:val="1004"/>
+        </w:numPr>
+      </w:pPr>
+      <w:r>
+        <w:t xml:space="preserve">Posible trabajo no conforme o no conformidad, para tratamiento conjunto con</w:t>
+      </w:r>
+      <w:r>
+        <w:t xml:space="preserve"> </w:t>
+      </w:r>
+      <w:r>
+        <w:rPr>
+          <w:rStyle w:val="VerbatimChar"/>
+        </w:rPr>
+        <w:t xml:space="preserve">P-PSEA-15</w:t>
+      </w:r>
+      <w:r>
+        <w:t xml:space="preserve">.</w:t>
+      </w:r>
+    </w:p>
+    <w:p>
+      <w:pPr>
+        <w:pStyle w:val="Compact"/>
+        <w:numPr>
+          <w:ilvl w:val="0"/>
+          <w:numId w:val="1004"/>
+        </w:numPr>
+      </w:pPr>
+      <w:r>
+        <w:t xml:space="preserve">Posible colusion o falsificacion, para traslado a</w:t>
+      </w:r>
+      <w:r>
+        <w:t xml:space="preserve"> </w:t>
+      </w:r>
+      <w:r>
+        <w:rPr>
+          <w:rStyle w:val="VerbatimChar"/>
+        </w:rPr>
+        <w:t xml:space="preserve">P-PSEA-14</w:t>
+      </w:r>
+      <w:r>
+        <w:t xml:space="preserve">.</w:t>
+      </w:r>
+    </w:p>
+    <w:p>
+      <w:pPr>
+        <w:pStyle w:val="FirstParagraph"/>
+      </w:pPr>
+      <w:r>
+        <w:t xml:space="preserve">La clasificacion y cualquier traslado deben comunicarse al reclamante sin divulgar informacion confidencial.</w:t>
+      </w:r>
+    </w:p>
     <w:bookmarkEnd w:id="15"/>
+    <w:bookmarkStart w:id="16" w:name="designacion-e-imparcialidad"/>
+    <w:p>
+      <w:pPr>
+        <w:pStyle w:val="Heading3"/>
+      </w:pPr>
+      <w:r>
+        <w:t xml:space="preserve">4.3 Designacion e imparcialidad</w:t>
+      </w:r>
+    </w:p>
+    <w:p>
+      <w:pPr>
+        <w:pStyle w:val="FirstParagraph"/>
+      </w:pPr>
+      <w:r>
+        <w:t xml:space="preserve">El responsable de calidad designa a una persona competente para evaluar la queja. Antes de iniciar la investigacion debe verificar y documentar que el evaluador y quien apruebe la decision no tengan conflicto de interes ni participacion directa en el asunto.</w:t>
+      </w:r>
+    </w:p>
+    <w:p>
+      <w:pPr>
+        <w:pStyle w:val="BodyText"/>
+      </w:pPr>
+      <w:r>
+        <w:t xml:space="preserve">La presentacion de una queja no debe generar acciones discriminatorias contra el reclamante.</w:t>
+      </w:r>
+    </w:p>
+    <w:bookmarkEnd w:id="16"/>
+    <w:bookmarkStart w:id="17" w:name="investigacion-y-evaluacion"/>
+    <w:p>
+      <w:pPr>
+        <w:pStyle w:val="Heading3"/>
+      </w:pPr>
+      <w:r>
+        <w:t xml:space="preserve">4.4 Investigacion y evaluacion</w:t>
+      </w:r>
+    </w:p>
+    <w:p>
+      <w:pPr>
+        <w:pStyle w:val="FirstParagraph"/>
+      </w:pPr>
+      <w:r>
+        <w:t xml:space="preserve">El responsable del caso debe recopilar y verificar la informacion necesaria, que puede incluir:</w:t>
+      </w:r>
+    </w:p>
+    <w:p>
+      <w:pPr>
+        <w:pStyle w:val="Compact"/>
+        <w:numPr>
+          <w:ilvl w:val="0"/>
+          <w:numId w:val="1005"/>
+        </w:numPr>
+      </w:pPr>
+      <w:r>
+        <w:t xml:space="preserve">La comunicacion original y sus anexos.</w:t>
+      </w:r>
+    </w:p>
+    <w:p>
+      <w:pPr>
+        <w:pStyle w:val="Compact"/>
+        <w:numPr>
+          <w:ilvl w:val="0"/>
+          <w:numId w:val="1005"/>
+        </w:numPr>
+      </w:pPr>
+      <w:r>
+        <w:t xml:space="preserve">Registros de la ronda y trazabilidad de las actuaciones.</w:t>
+      </w:r>
+    </w:p>
+    <w:p>
+      <w:pPr>
+        <w:pStyle w:val="Compact"/>
+        <w:numPr>
+          <w:ilvl w:val="0"/>
+          <w:numId w:val="1005"/>
+        </w:numPr>
+      </w:pPr>
+      <w:r>
+        <w:t xml:space="preserve">Comunicaciones con el participante.</w:t>
+      </w:r>
+    </w:p>
+    <w:p>
+      <w:pPr>
+        <w:pStyle w:val="Compact"/>
+        <w:numPr>
+          <w:ilvl w:val="0"/>
+          <w:numId w:val="1005"/>
+        </w:numPr>
+      </w:pPr>
+      <w:r>
+        <w:t xml:space="preserve">Registros tecnicos, administrativos o del aplicativo.</w:t>
+      </w:r>
+    </w:p>
+    <w:p>
+      <w:pPr>
+        <w:pStyle w:val="Compact"/>
+        <w:numPr>
+          <w:ilvl w:val="0"/>
+          <w:numId w:val="1005"/>
+        </w:numPr>
+      </w:pPr>
+      <w:r>
+        <w:t xml:space="preserve">Declaraciones del personal o de proveedores involucrados.</w:t>
+      </w:r>
+    </w:p>
+    <w:p>
+      <w:pPr>
+        <w:pStyle w:val="Compact"/>
+        <w:numPr>
+          <w:ilvl w:val="0"/>
+          <w:numId w:val="1005"/>
+        </w:numPr>
+      </w:pPr>
+      <w:r>
+        <w:t xml:space="preserve">Requisitos contractuales, normativos y documentales aplicables.</w:t>
+      </w:r>
+    </w:p>
+    <w:p>
+      <w:pPr>
+        <w:pStyle w:val="FirstParagraph"/>
+      </w:pPr>
+      <w:r>
+        <w:t xml:space="preserve">El analisis, las evidencias revisadas y las conclusiones deben quedar documentados en</w:t>
+      </w:r>
+      <w:r>
+        <w:t xml:space="preserve"> </w:t>
+      </w:r>
+      <w:r>
+        <w:rPr>
+          <w:rStyle w:val="VerbatimChar"/>
+        </w:rPr>
+        <w:t xml:space="preserve">F-PSEA-14</w:t>
+      </w:r>
+      <w:r>
+        <w:t xml:space="preserve">. Cuando la queja revele trabajo no conforme o una no conformidad, se deben aplicar las correcciones y acciones correspondientes conforme a</w:t>
+      </w:r>
+      <w:r>
+        <w:t xml:space="preserve"> </w:t>
+      </w:r>
+      <w:r>
+        <w:rPr>
+          <w:rStyle w:val="VerbatimChar"/>
+        </w:rPr>
+        <w:t xml:space="preserve">P-PSEA-15</w:t>
+      </w:r>
+      <w:r>
+        <w:t xml:space="preserve">, sin perder el vinculo con el caso original.</w:t>
+      </w:r>
+    </w:p>
+    <w:bookmarkEnd w:id="17"/>
+    <w:bookmarkStart w:id="18" w:name="decision-y-respuesta"/>
+    <w:p>
+      <w:pPr>
+        <w:pStyle w:val="Heading3"/>
+      </w:pPr>
+      <w:r>
+        <w:t xml:space="preserve">4.5 Decision y respuesta</w:t>
+      </w:r>
+    </w:p>
+    <w:p>
+      <w:pPr>
+        <w:pStyle w:val="FirstParagraph"/>
+      </w:pPr>
+      <w:r>
+        <w:t xml:space="preserve">La decision debe ser revisada y aprobada por una persona que no haya participado en la actividad que origino la queja. El resultado puede ser:</w:t>
+      </w:r>
+    </w:p>
+    <w:p>
+      <w:pPr>
+        <w:pStyle w:val="Compact"/>
+        <w:numPr>
+          <w:ilvl w:val="0"/>
+          <w:numId w:val="1006"/>
+        </w:numPr>
+      </w:pPr>
+      <w:r>
+        <w:t xml:space="preserve">Procedente.</w:t>
+      </w:r>
+    </w:p>
+    <w:p>
+      <w:pPr>
+        <w:pStyle w:val="Compact"/>
+        <w:numPr>
+          <w:ilvl w:val="0"/>
+          <w:numId w:val="1006"/>
+        </w:numPr>
+      </w:pPr>
+      <w:r>
+        <w:t xml:space="preserve">No procedente.</w:t>
+      </w:r>
+    </w:p>
+    <w:p>
+      <w:pPr>
+        <w:pStyle w:val="Compact"/>
+        <w:numPr>
+          <w:ilvl w:val="0"/>
+          <w:numId w:val="1006"/>
+        </w:numPr>
+      </w:pPr>
+      <w:r>
+        <w:t xml:space="preserve">Parcialmente procedente.</w:t>
+      </w:r>
+    </w:p>
+    <w:p>
+      <w:pPr>
+        <w:pStyle w:val="FirstParagraph"/>
+      </w:pPr>
+      <w:r>
+        <w:t xml:space="preserve">La respuesta al reclamante debe emitirse por un canal formal e incluir, como minimo, la conclusion, su fundamento y las acciones adoptadas que puedan comunicarse. Cuando la investigacion requiera mas tiempo, el PEA debe informar el avance y mantener trazabilidad de las comunicaciones.</w:t>
+      </w:r>
+    </w:p>
+    <w:bookmarkEnd w:id="18"/>
+    <w:bookmarkStart w:id="19" w:name="seguimiento-y-cierre"/>
+    <w:p>
+      <w:pPr>
+        <w:pStyle w:val="Heading3"/>
+      </w:pPr>
+      <w:r>
+        <w:t xml:space="preserve">4.6 Seguimiento y cierre</w:t>
+      </w:r>
+    </w:p>
+    <w:p>
+      <w:pPr>
+        <w:pStyle w:val="FirstParagraph"/>
+      </w:pPr>
+      <w:r>
+        <w:t xml:space="preserve">La queja se cierra cuando:</w:t>
+      </w:r>
+    </w:p>
+    <w:p>
+      <w:pPr>
+        <w:pStyle w:val="Compact"/>
+        <w:numPr>
+          <w:ilvl w:val="0"/>
+          <w:numId w:val="1007"/>
+        </w:numPr>
+      </w:pPr>
+      <w:r>
+        <w:t xml:space="preserve">La decision fue aprobada y comunicada al reclamante.</w:t>
+      </w:r>
+    </w:p>
+    <w:p>
+      <w:pPr>
+        <w:pStyle w:val="Compact"/>
+        <w:numPr>
+          <w:ilvl w:val="0"/>
+          <w:numId w:val="1007"/>
+        </w:numPr>
+      </w:pPr>
+      <w:r>
+        <w:t xml:space="preserve">Las evidencias y comunicaciones quedaron archivadas.</w:t>
+      </w:r>
+    </w:p>
+    <w:p>
+      <w:pPr>
+        <w:pStyle w:val="Compact"/>
+        <w:numPr>
+          <w:ilvl w:val="0"/>
+          <w:numId w:val="1007"/>
+        </w:numPr>
+      </w:pPr>
+      <w:r>
+        <w:t xml:space="preserve">Las correcciones inmediatas fueron ejecutadas.</w:t>
+      </w:r>
+    </w:p>
+    <w:p>
+      <w:pPr>
+        <w:pStyle w:val="Compact"/>
+        <w:numPr>
+          <w:ilvl w:val="0"/>
+          <w:numId w:val="1007"/>
+        </w:numPr>
+      </w:pPr>
+      <w:r>
+        <w:t xml:space="preserve">Las acciones derivadas quedaron cerradas o formalmente transferidas a</w:t>
+      </w:r>
+      <w:r>
+        <w:t xml:space="preserve"> </w:t>
+      </w:r>
+      <w:r>
+        <w:rPr>
+          <w:rStyle w:val="VerbatimChar"/>
+        </w:rPr>
+        <w:t xml:space="preserve">P-PSEA-15</w:t>
+      </w:r>
+      <w:r>
+        <w:t xml:space="preserve"> </w:t>
+      </w:r>
+      <w:r>
+        <w:t xml:space="preserve">u otro procedimiento aplicable.</w:t>
+      </w:r>
+    </w:p>
+    <w:p>
+      <w:pPr>
+        <w:pStyle w:val="Compact"/>
+        <w:numPr>
+          <w:ilvl w:val="0"/>
+          <w:numId w:val="1007"/>
+        </w:numPr>
+      </w:pPr>
+      <w:r>
+        <w:t xml:space="preserve">Se registro la fecha y la aprobacion del cierre.</w:t>
+      </w:r>
+    </w:p>
+    <w:p>
+      <w:pPr>
+        <w:pStyle w:val="FirstParagraph"/>
+      </w:pPr>
+      <w:r>
+        <w:t xml:space="preserve">El responsable de calidad debe conservar la trazabilidad del caso y considerar las tendencias de quejas como entrada para la mejora continua definida en</w:t>
+      </w:r>
+      <w:r>
+        <w:t xml:space="preserve"> </w:t>
+      </w:r>
+      <w:r>
+        <w:rPr>
+          <w:rStyle w:val="VerbatimChar"/>
+        </w:rPr>
+        <w:t xml:space="preserve">P-PSEA-23</w:t>
+      </w:r>
+      <w:r>
+        <w:t xml:space="preserve">.</w:t>
+      </w:r>
+    </w:p>
+    <w:bookmarkEnd w:id="19"/>
+    <w:bookmarkEnd w:id="20"/>
+    <w:bookmarkStart w:id="21" w:name="registro-asociado"/>
+    <w:p>
+      <w:pPr>
+        <w:pStyle w:val="Heading2"/>
+      </w:pPr>
+      <w:r>
+        <w:t xml:space="preserve">5. Registro asociado</w:t>
+      </w:r>
+    </w:p>
+    <w:p>
+      <w:pPr>
+        <w:pStyle w:val="FirstParagraph"/>
+      </w:pPr>
+      <w:r>
+        <w:t xml:space="preserve">Las quejas y los casos de no conformidad que se deriven de ellas se documentan en</w:t>
+      </w:r>
+      <w:r>
+        <w:t xml:space="preserve"> </w:t>
+      </w:r>
+      <w:r>
+        <w:rPr>
+          <w:rStyle w:val="VerbatimChar"/>
+        </w:rPr>
+        <w:t xml:space="preserve">F-PSEA-14 - Registro/caso de queja o NC segun aplique</w:t>
+      </w:r>
+      <w:r>
+        <w:t xml:space="preserve"> </w:t>
+      </w:r>
+      <w:r>
+        <w:t xml:space="preserve">y, cuando corresponda, en el modulo de casos SGC de</w:t>
+      </w:r>
+      <w:r>
+        <w:t xml:space="preserve"> </w:t>
+      </w:r>
+      <w:r>
+        <w:rPr>
+          <w:rStyle w:val="VerbatimChar"/>
+        </w:rPr>
+        <w:t xml:space="preserve">calaire-app</w:t>
+      </w:r>
+      <w:r>
+        <w:t xml:space="preserve">.</w:t>
+      </w:r>
+    </w:p>
+    <w:bookmarkEnd w:id="21"/>
+    <w:bookmarkStart w:id="22" w:name="relaciones-documentales"/>
+    <w:p>
+      <w:pPr>
+        <w:pStyle w:val="Heading2"/>
+      </w:pPr>
+      <w:r>
+        <w:t xml:space="preserve">6. Relaciones documentales</w:t>
+      </w:r>
+    </w:p>
+    <w:tbl>
+      <w:tblPr>
+        <w:tblStyle w:val="Table"/>
+        <w:tblW w:type="pct" w:w="5000"/>
+        <w:tblLayout w:type="fixed"/>
+        <w:tblLook w:firstRow="1" w:lastRow="0" w:firstColumn="0" w:lastColumn="0" w:noHBand="0" w:noVBand="0" w:val="0020"/>
+      </w:tblPr>
+      <w:tblGrid>
+        <w:gridCol w:w="2640"/>
+        <w:gridCol w:w="2640"/>
+        <w:gridCol w:w="2640"/>
+      </w:tblGrid>
+      <w:tr>
+        <w:trPr>
+          <w:tblHeader w:val="on"/>
+        </w:trPr>
+        <w:tc>
+          <w:tcPr/>
+          <w:p>
+            <w:pPr>
+              <w:pStyle w:val="Compact"/>
+            </w:pPr>
+            <w:r>
+              <w:t xml:space="preserve">Codigo</w:t>
+            </w:r>
+          </w:p>
+        </w:tc>
+        <w:tc>
+          <w:tcPr/>
+          <w:p>
+            <w:pPr>
+              <w:pStyle w:val="Compact"/>
+            </w:pPr>
+            <w:r>
+              <w:t xml:space="preserve">Relacion</w:t>
+            </w:r>
+          </w:p>
+        </w:tc>
+        <w:tc>
+          <w:tcPr/>
+          <w:p>
+            <w:pPr>
+              <w:pStyle w:val="Compact"/>
+            </w:pPr>
+            <w:r>
+              <w:t xml:space="preserve">Tipo de vinculo</w:t>
+            </w:r>
+          </w:p>
+        </w:tc>
+      </w:tr>
+      <w:tr>
+        <w:tc>
+          <w:tcPr/>
+          <w:p>
+            <w:pPr>
+              <w:pStyle w:val="Compact"/>
+            </w:pPr>
+            <w:r>
+              <w:rPr>
+                <w:rStyle w:val="VerbatimChar"/>
+              </w:rPr>
+              <w:t xml:space="preserve">F-PSEA-14</w:t>
+            </w:r>
+          </w:p>
+        </w:tc>
+        <w:tc>
+          <w:tcPr/>
+          <w:p>
+            <w:pPr>
+              <w:pStyle w:val="Compact"/>
+            </w:pPr>
+            <w:r>
+              <w:t xml:space="preserve">Registro de la queja y de las NC derivadas.</w:t>
+            </w:r>
+          </w:p>
+        </w:tc>
+        <w:tc>
+          <w:tcPr/>
+          <w:p>
+            <w:pPr>
+              <w:pStyle w:val="Compact"/>
+            </w:pPr>
+            <w:r>
+              <w:t xml:space="preserve">Obligatorio</w:t>
+            </w:r>
+          </w:p>
+        </w:tc>
+      </w:tr>
+      <w:tr>
+        <w:tc>
+          <w:tcPr/>
+          <w:p>
+            <w:pPr>
+              <w:pStyle w:val="Compact"/>
+            </w:pPr>
+            <w:r>
+              <w:rPr>
+                <w:rStyle w:val="VerbatimChar"/>
+              </w:rPr>
+              <w:t xml:space="preserve">P-PSEA-05</w:t>
+            </w:r>
+          </w:p>
+        </w:tc>
+        <w:tc>
+          <w:tcPr/>
+          <w:p>
+            <w:pPr>
+              <w:pStyle w:val="Compact"/>
+            </w:pPr>
+            <w:r>
+              <w:t xml:space="preserve">Comunicaciones oficiales del PEA.</w:t>
+            </w:r>
+          </w:p>
+        </w:tc>
+        <w:tc>
+          <w:tcPr/>
+          <w:p>
+            <w:pPr>
+              <w:pStyle w:val="Compact"/>
+            </w:pPr>
+            <w:r>
+              <w:t xml:space="preserve">Obligatorio</w:t>
+            </w:r>
+          </w:p>
+        </w:tc>
+      </w:tr>
+      <w:tr>
+        <w:tc>
+          <w:tcPr/>
+          <w:p>
+            <w:pPr>
+              <w:pStyle w:val="Compact"/>
+            </w:pPr>
+            <w:r>
+              <w:rPr>
+                <w:rStyle w:val="VerbatimChar"/>
+              </w:rPr>
+              <w:t xml:space="preserve">P-PSEA-15</w:t>
+            </w:r>
+          </w:p>
+        </w:tc>
+        <w:tc>
+          <w:tcPr/>
+          <w:p>
+            <w:pPr>
+              <w:pStyle w:val="Compact"/>
+            </w:pPr>
+            <w:r>
+              <w:t xml:space="preserve">Trabajo no conforme, no conformidades y acciones correctivas derivadas.</w:t>
+            </w:r>
+          </w:p>
+        </w:tc>
+        <w:tc>
+          <w:tcPr/>
+          <w:p>
+            <w:pPr>
+              <w:pStyle w:val="Compact"/>
+            </w:pPr>
+            <w:r>
+              <w:t xml:space="preserve">Condicional</w:t>
+            </w:r>
+          </w:p>
+        </w:tc>
+      </w:tr>
+      <w:tr>
+        <w:tc>
+          <w:tcPr/>
+          <w:p>
+            <w:pPr>
+              <w:pStyle w:val="Compact"/>
+            </w:pPr>
+            <w:r>
+              <w:rPr>
+                <w:rStyle w:val="VerbatimChar"/>
+              </w:rPr>
+              <w:t xml:space="preserve">P-PSEA-18</w:t>
+            </w:r>
+          </w:p>
+        </w:tc>
+        <w:tc>
+          <w:tcPr/>
+          <w:p>
+            <w:pPr>
+              <w:pStyle w:val="Compact"/>
+            </w:pPr>
+            <w:r>
+              <w:t xml:space="preserve">Apelaciones del PEA, para diferenciar y trasladar casos.</w:t>
+            </w:r>
+          </w:p>
+        </w:tc>
+        <w:tc>
+          <w:tcPr/>
+          <w:p>
+            <w:pPr>
+              <w:pStyle w:val="Compact"/>
+            </w:pPr>
+            <w:r>
+              <w:t xml:space="preserve">Referencia</w:t>
+            </w:r>
+          </w:p>
+        </w:tc>
+      </w:tr>
+      <w:tr>
+        <w:tc>
+          <w:tcPr/>
+          <w:p>
+            <w:pPr>
+              <w:pStyle w:val="Compact"/>
+            </w:pPr>
+            <w:r>
+              <w:rPr>
+                <w:rStyle w:val="VerbatimChar"/>
+              </w:rPr>
+              <w:t xml:space="preserve">P-PSEA-19</w:t>
+            </w:r>
+          </w:p>
+        </w:tc>
+        <w:tc>
+          <w:tcPr/>
+          <w:p>
+            <w:pPr>
+              <w:pStyle w:val="Compact"/>
+            </w:pPr>
+            <w:r>
+              <w:t xml:space="preserve">Confidencialidad operativa interna del PEA.</w:t>
+            </w:r>
+          </w:p>
+        </w:tc>
+        <w:tc>
+          <w:tcPr/>
+          <w:p>
+            <w:pPr>
+              <w:pStyle w:val="Compact"/>
+            </w:pPr>
+            <w:r>
+              <w:t xml:space="preserve">Obligatorio</w:t>
+            </w:r>
+          </w:p>
+        </w:tc>
+      </w:tr>
+      <w:tr>
+        <w:tc>
+          <w:tcPr/>
+          <w:p>
+            <w:pPr>
+              <w:pStyle w:val="Compact"/>
+            </w:pPr>
+            <w:r>
+              <w:rPr>
+                <w:rStyle w:val="VerbatimChar"/>
+              </w:rPr>
+              <w:t xml:space="preserve">P-PSEA-23</w:t>
+            </w:r>
+          </w:p>
+        </w:tc>
+        <w:tc>
+          <w:tcPr/>
+          <w:p>
+            <w:pPr>
+              <w:pStyle w:val="Compact"/>
+            </w:pPr>
+            <w:r>
+              <w:t xml:space="preserve">Mejora continua del PEA.</w:t>
+            </w:r>
+          </w:p>
+        </w:tc>
+        <w:tc>
+          <w:tcPr/>
+          <w:p>
+            <w:pPr>
+              <w:pStyle w:val="Compact"/>
+            </w:pPr>
+            <w:r>
+              <w:t xml:space="preserve">Referencia</w:t>
+            </w:r>
+          </w:p>
+        </w:tc>
+      </w:tr>
+      <w:tr>
+        <w:tc>
+          <w:tcPr/>
+          <w:p>
+            <w:pPr>
+              <w:pStyle w:val="Compact"/>
+            </w:pPr>
+            <w:r>
+              <w:rPr>
+                <w:rStyle w:val="VerbatimChar"/>
+              </w:rPr>
+              <w:t xml:space="preserve">DG-PSEA-02</w:t>
+            </w:r>
+          </w:p>
+        </w:tc>
+        <w:tc>
+          <w:tcPr/>
+          <w:p>
+            <w:pPr>
+              <w:pStyle w:val="Compact"/>
+            </w:pPr>
+            <w:r>
+              <w:t xml:space="preserve">Aplicativo</w:t>
+            </w:r>
+            <w:r>
+              <w:t xml:space="preserve"> </w:t>
+            </w:r>
+            <w:r>
+              <w:rPr>
+                <w:rStyle w:val="VerbatimChar"/>
+              </w:rPr>
+              <w:t xml:space="preserve">calaire-app</w:t>
+            </w:r>
+            <w:r>
+              <w:t xml:space="preserve"> </w:t>
+            </w:r>
+            <w:r>
+              <w:t xml:space="preserve">para la gestion de casos SGC.</w:t>
+            </w:r>
+          </w:p>
+        </w:tc>
+        <w:tc>
+          <w:tcPr/>
+          <w:p>
+            <w:pPr>
+              <w:pStyle w:val="Compact"/>
+            </w:pPr>
+            <w:r>
+              <w:t xml:space="preserve">Obligatorio cuando el caso se gestione en el aplicativo.</w:t>
+            </w:r>
+          </w:p>
+        </w:tc>
+      </w:tr>
+      <w:tr>
+        <w:tc>
+          <w:tcPr/>
+          <w:p>
+            <w:pPr>
+              <w:pStyle w:val="Compact"/>
+            </w:pPr>
+            <w:r>
+              <w:rPr>
+                <w:rStyle w:val="VerbatimChar"/>
+              </w:rPr>
+              <w:t xml:space="preserve">F-PSEA-13</w:t>
+            </w:r>
+          </w:p>
+        </w:tc>
+        <w:tc>
+          <w:tcPr/>
+          <w:p>
+            <w:pPr>
+              <w:pStyle w:val="Compact"/>
+            </w:pPr>
+            <w:r>
+              <w:t xml:space="preserve">Informe final de resultados, cuando la queja lo afecte.</w:t>
+            </w:r>
+          </w:p>
+        </w:tc>
+        <w:tc>
+          <w:tcPr/>
+          <w:p>
+            <w:pPr>
+              <w:pStyle w:val="Compact"/>
+            </w:pPr>
+            <w:r>
+              <w:t xml:space="preserve">Referencia</w:t>
+            </w:r>
+          </w:p>
+        </w:tc>
+      </w:tr>
+    </w:tbl>
+    <w:bookmarkEnd w:id="22"/>
+    <w:bookmarkStart w:id="23" w:name="trazabilidad-normativa"/>
+    <w:p>
+      <w:pPr>
+        <w:pStyle w:val="Heading2"/>
+      </w:pPr>
+      <w:r>
+        <w:t xml:space="preserve">7. Trazabilidad normativa</w:t>
+      </w:r>
+    </w:p>
+    <w:tbl>
+      <w:tblPr>
+        <w:tblStyle w:val="Table"/>
+        <w:tblW w:type="pct" w:w="5000"/>
+        <w:tblLayout w:type="fixed"/>
+        <w:tblLook w:firstRow="1" w:lastRow="0" w:firstColumn="0" w:lastColumn="0" w:noHBand="0" w:noVBand="0" w:val="0020"/>
+      </w:tblPr>
+      <w:tblGrid>
+        <w:gridCol w:w="2640"/>
+        <w:gridCol w:w="2640"/>
+        <w:gridCol w:w="2640"/>
+      </w:tblGrid>
+      <w:tr>
+        <w:trPr>
+          <w:tblHeader w:val="on"/>
+        </w:trPr>
+        <w:tc>
+          <w:tcPr/>
+          <w:p>
+            <w:pPr>
+              <w:pStyle w:val="Compact"/>
+            </w:pPr>
+            <w:r>
+              <w:t xml:space="preserve">Norma</w:t>
+            </w:r>
+          </w:p>
+        </w:tc>
+        <w:tc>
+          <w:tcPr/>
+          <w:p>
+            <w:pPr>
+              <w:pStyle w:val="Compact"/>
+            </w:pPr>
+            <w:r>
+              <w:t xml:space="preserve">Clausula</w:t>
+            </w:r>
+          </w:p>
+        </w:tc>
+        <w:tc>
+          <w:tcPr/>
+          <w:p>
+            <w:pPr>
+              <w:pStyle w:val="Compact"/>
+            </w:pPr>
+            <w:r>
+              <w:t xml:space="preserve">Aplicacion</w:t>
+            </w:r>
+          </w:p>
+        </w:tc>
+      </w:tr>
+      <w:tr>
+        <w:tc>
+          <w:tcPr/>
+          <w:p>
+            <w:pPr>
+              <w:pStyle w:val="Compact"/>
+            </w:pPr>
+            <w:r>
+              <w:t xml:space="preserve">ISO/IEC 17043:2023</w:t>
+            </w:r>
+          </w:p>
+        </w:tc>
+        <w:tc>
+          <w:tcPr/>
+          <w:p>
+            <w:pPr>
+              <w:pStyle w:val="Compact"/>
+            </w:pPr>
+            <w:r>
+              <w:t xml:space="preserve">7.9</w:t>
+            </w:r>
+          </w:p>
+        </w:tc>
+        <w:tc>
+          <w:tcPr/>
+          <w:p>
+            <w:pPr>
+              <w:pStyle w:val="Compact"/>
+            </w:pPr>
+            <w:r>
+              <w:t xml:space="preserve">Proceso para recibir, evaluar y decidir sobre quejas.</w:t>
+            </w:r>
+          </w:p>
+        </w:tc>
+      </w:tr>
+      <w:tr>
+        <w:tc>
+          <w:tcPr/>
+          <w:p>
+            <w:pPr>
+              <w:pStyle w:val="Compact"/>
+            </w:pPr>
+            <w:r>
+              <w:t xml:space="preserve">ISO/IEC 17043:2023</w:t>
+            </w:r>
+          </w:p>
+        </w:tc>
+        <w:tc>
+          <w:tcPr/>
+          <w:p>
+            <w:pPr>
+              <w:pStyle w:val="Compact"/>
+            </w:pPr>
+            <w:r>
+              <w:t xml:space="preserve">8.10</w:t>
+            </w:r>
+          </w:p>
+        </w:tc>
+        <w:tc>
+          <w:tcPr/>
+          <w:p>
+            <w:pPr>
+              <w:pStyle w:val="Compact"/>
+            </w:pPr>
+            <w:r>
+              <w:t xml:space="preserve">Registro y tratamiento de quejas dentro del sistema de gestion.</w:t>
+            </w:r>
+          </w:p>
+        </w:tc>
+      </w:tr>
+    </w:tbl>
+    <w:bookmarkEnd w:id="23"/>
+    <w:bookmarkStart w:id="24" w:name="limites"/>
+    <w:p>
+      <w:pPr>
+        <w:pStyle w:val="Heading2"/>
+      </w:pPr>
+      <w:r>
+        <w:t xml:space="preserve">8. Limites</w:t>
+      </w:r>
+    </w:p>
+    <w:p>
+      <w:pPr>
+        <w:pStyle w:val="Compact"/>
+        <w:numPr>
+          <w:ilvl w:val="0"/>
+          <w:numId w:val="1008"/>
+        </w:numPr>
+      </w:pPr>
+      <w:r>
+        <w:t xml:space="preserve">Este procedimiento no resuelve apelaciones; estas se gestionan mediante</w:t>
+      </w:r>
+      <w:r>
+        <w:t xml:space="preserve"> </w:t>
+      </w:r>
+      <w:r>
+        <w:rPr>
+          <w:rStyle w:val="VerbatimChar"/>
+        </w:rPr>
+        <w:t xml:space="preserve">P-PSEA-18</w:t>
+      </w:r>
+      <w:r>
+        <w:t xml:space="preserve">.</w:t>
+      </w:r>
+    </w:p>
+    <w:p>
+      <w:pPr>
+        <w:pStyle w:val="Compact"/>
+        <w:numPr>
+          <w:ilvl w:val="0"/>
+          <w:numId w:val="1008"/>
+        </w:numPr>
+      </w:pPr>
+      <w:r>
+        <w:t xml:space="preserve">La recepcion de una queja no implica que sea procedente.</w:t>
+      </w:r>
+    </w:p>
+    <w:p>
+      <w:pPr>
+        <w:pStyle w:val="Compact"/>
+        <w:numPr>
+          <w:ilvl w:val="0"/>
+          <w:numId w:val="1008"/>
+        </w:numPr>
+      </w:pPr>
+      <w:r>
+        <w:t xml:space="preserve">La respuesta no debe divulgar datos, resultados ni informacion sensible de otros participantes.</w:t>
+      </w:r>
+    </w:p>
+    <w:p>
+      <w:pPr>
+        <w:pStyle w:val="Compact"/>
+        <w:numPr>
+          <w:ilvl w:val="0"/>
+          <w:numId w:val="1008"/>
+        </w:numPr>
+      </w:pPr>
+      <w:r>
+        <w:t xml:space="preserve">El cierre de la queja no reemplaza el cierre de las NC o acciones correctivas derivadas.</w:t>
+      </w:r>
+    </w:p>
+    <w:bookmarkEnd w:id="24"/>
+    <w:bookmarkEnd w:id="25"/>
     <w:sectPr>
       <w:headerReference r:id="rId2" w:type="default"/>
       <w:type w:val="nextPage"/>
@@ -1329,6 +2727,91 @@
       </w:rPr>
     </w:lvl>
   </w:abstractNum>
+  <w:abstractNum w:abstractNumId="99411">
+    <w:nsid w:val="00A99411"/>
+    <w:multiLevelType w:val="multilevel"/>
+    <w:lvl w:ilvl="0">
+      <w:start w:val="1"/>
+      <w:numFmt w:val="decimal"/>
+      <w:lvlText w:val="%1."/>
+      <w:lvlJc w:val="left"/>
+      <w:pPr>
+        <w:ind w:left="720" w:hanging="360"/>
+      </w:pPr>
+    </w:lvl>
+    <w:lvl w:ilvl="1">
+      <w:start w:val="1"/>
+      <w:numFmt w:val="decimal"/>
+      <w:lvlText w:val="%2."/>
+      <w:lvlJc w:val="left"/>
+      <w:pPr>
+        <w:ind w:left="1440" w:hanging="360"/>
+      </w:pPr>
+    </w:lvl>
+    <w:lvl w:ilvl="2">
+      <w:start w:val="1"/>
+      <w:numFmt w:val="decimal"/>
+      <w:lvlText w:val="%3."/>
+      <w:lvlJc w:val="left"/>
+      <w:pPr>
+        <w:ind w:left="2160" w:hanging="360"/>
+      </w:pPr>
+    </w:lvl>
+    <w:lvl w:ilvl="3">
+      <w:start w:val="1"/>
+      <w:numFmt w:val="decimal"/>
+      <w:lvlText w:val="%4."/>
+      <w:lvlJc w:val="left"/>
+      <w:pPr>
+        <w:ind w:left="2880" w:hanging="360"/>
+      </w:pPr>
+    </w:lvl>
+    <w:lvl w:ilvl="4">
+      <w:start w:val="1"/>
+      <w:numFmt w:val="decimal"/>
+      <w:lvlText w:val="%5."/>
+      <w:lvlJc w:val="left"/>
+      <w:pPr>
+        <w:ind w:left="3600" w:hanging="360"/>
+      </w:pPr>
+    </w:lvl>
+    <w:lvl w:ilvl="5">
+      <w:start w:val="1"/>
+      <w:numFmt w:val="decimal"/>
+      <w:lvlText w:val="%6."/>
+      <w:lvlJc w:val="left"/>
+      <w:pPr>
+        <w:ind w:left="4320" w:hanging="360"/>
+      </w:pPr>
+    </w:lvl>
+    <w:lvl w:ilvl="6">
+      <w:start w:val="1"/>
+      <w:numFmt w:val="decimal"/>
+      <w:lvlText w:val="%7."/>
+      <w:lvlJc w:val="left"/>
+      <w:pPr>
+        <w:ind w:left="5040" w:hanging="360"/>
+      </w:pPr>
+    </w:lvl>
+    <w:lvl w:ilvl="7">
+      <w:start w:val="1"/>
+      <w:numFmt w:val="decimal"/>
+      <w:lvlText w:val="%8."/>
+      <w:lvlJc w:val="left"/>
+      <w:pPr>
+        <w:ind w:left="5760" w:hanging="360"/>
+      </w:pPr>
+    </w:lvl>
+    <w:lvl w:ilvl="8">
+      <w:start w:val="1"/>
+      <w:numFmt w:val="decimal"/>
+      <w:lvlText w:val="%9."/>
+      <w:lvlJc w:val="left"/>
+      <w:pPr>
+        <w:ind w:left="6480" w:hanging="360"/>
+      </w:pPr>
+    </w:lvl>
+  </w:abstractNum>
   <w:num w:numId="1">
     <w:abstractNumId w:val="1"/>
   </w:num>
@@ -1342,6 +2825,78 @@
     <w:abstractNumId w:val="991"/>
   </w:num>
   <w:num w:numId="1002">
+    <w:abstractNumId w:val="991"/>
+  </w:num>
+  <w:num w:numId="1003">
+    <w:abstractNumId w:val="99411"/>
+    <w:lvlOverride w:ilvl="0">
+      <w:startOverride w:val="1"/>
+    </w:lvlOverride>
+    <w:lvlOverride w:ilvl="1">
+      <w:startOverride w:val="1"/>
+    </w:lvlOverride>
+    <w:lvlOverride w:ilvl="2">
+      <w:startOverride w:val="1"/>
+    </w:lvlOverride>
+    <w:lvlOverride w:ilvl="3">
+      <w:startOverride w:val="1"/>
+    </w:lvlOverride>
+    <w:lvlOverride w:ilvl="4">
+      <w:startOverride w:val="1"/>
+    </w:lvlOverride>
+    <w:lvlOverride w:ilvl="5">
+      <w:startOverride w:val="1"/>
+    </w:lvlOverride>
+    <w:lvlOverride w:ilvl="6">
+      <w:startOverride w:val="1"/>
+    </w:lvlOverride>
+    <w:lvlOverride w:ilvl="7">
+      <w:startOverride w:val="1"/>
+    </w:lvlOverride>
+    <w:lvlOverride w:ilvl="8">
+      <w:startOverride w:val="1"/>
+    </w:lvlOverride>
+  </w:num>
+  <w:num w:numId="1004">
+    <w:abstractNumId w:val="991"/>
+  </w:num>
+  <w:num w:numId="1005">
+    <w:abstractNumId w:val="991"/>
+  </w:num>
+  <w:num w:numId="1006">
+    <w:abstractNumId w:val="991"/>
+  </w:num>
+  <w:num w:numId="1007">
+    <w:abstractNumId w:val="99411"/>
+    <w:lvlOverride w:ilvl="0">
+      <w:startOverride w:val="1"/>
+    </w:lvlOverride>
+    <w:lvlOverride w:ilvl="1">
+      <w:startOverride w:val="1"/>
+    </w:lvlOverride>
+    <w:lvlOverride w:ilvl="2">
+      <w:startOverride w:val="1"/>
+    </w:lvlOverride>
+    <w:lvlOverride w:ilvl="3">
+      <w:startOverride w:val="1"/>
+    </w:lvlOverride>
+    <w:lvlOverride w:ilvl="4">
+      <w:startOverride w:val="1"/>
+    </w:lvlOverride>
+    <w:lvlOverride w:ilvl="5">
+      <w:startOverride w:val="1"/>
+    </w:lvlOverride>
+    <w:lvlOverride w:ilvl="6">
+      <w:startOverride w:val="1"/>
+    </w:lvlOverride>
+    <w:lvlOverride w:ilvl="7">
+      <w:startOverride w:val="1"/>
+    </w:lvlOverride>
+    <w:lvlOverride w:ilvl="8">
+      <w:startOverride w:val="1"/>
+    </w:lvlOverride>
+  </w:num>
+  <w:num w:numId="1008">
     <w:abstractNumId w:val="991"/>
   </w:num>
 </w:numbering>
@@ -2584,13 +4139,239 @@
     <w:name w:val="WW8Num46"/>
     <w:qFormat/>
   </w:style>
-  <w:style w:type="paragraph" w:customStyle="1" w:styleId="SourceCode">
+  <w:style w:customStyle="1" w:styleId="SourceCode" w:type="paragraph">
     <w:name w:val="Source Code"/>
     <w:basedOn w:val="Normal"/>
     <w:link w:val="VerbatimChar"/>
     <w:pPr>
       <w:wordWrap w:val="off"/>
     </w:pPr>
+  </w:style>
+  <w:style w:customStyle="1" w:styleId="KeywordTok" w:type="character">
+    <w:name w:val="KeywordTok"/>
+    <w:basedOn w:val="VerbatimChar"/>
+    <w:rPr>
+      <w:b/>
+      <w:color w:val="007020"/>
+    </w:rPr>
+  </w:style>
+  <w:style w:customStyle="1" w:styleId="DataTypeTok" w:type="character">
+    <w:name w:val="DataTypeTok"/>
+    <w:basedOn w:val="VerbatimChar"/>
+    <w:rPr>
+      <w:color w:val="902000"/>
+    </w:rPr>
+  </w:style>
+  <w:style w:customStyle="1" w:styleId="DecValTok" w:type="character">
+    <w:name w:val="DecValTok"/>
+    <w:basedOn w:val="VerbatimChar"/>
+    <w:rPr>
+      <w:color w:val="40a070"/>
+    </w:rPr>
+  </w:style>
+  <w:style w:customStyle="1" w:styleId="BaseNTok" w:type="character">
+    <w:name w:val="BaseNTok"/>
+    <w:basedOn w:val="VerbatimChar"/>
+    <w:rPr>
+      <w:color w:val="40a070"/>
+    </w:rPr>
+  </w:style>
+  <w:style w:customStyle="1" w:styleId="FloatTok" w:type="character">
+    <w:name w:val="FloatTok"/>
+    <w:basedOn w:val="VerbatimChar"/>
+    <w:rPr>
+      <w:color w:val="40a070"/>
+    </w:rPr>
+  </w:style>
+  <w:style w:customStyle="1" w:styleId="ConstantTok" w:type="character">
+    <w:name w:val="ConstantTok"/>
+    <w:basedOn w:val="VerbatimChar"/>
+    <w:rPr>
+      <w:color w:val="880000"/>
+    </w:rPr>
+  </w:style>
+  <w:style w:customStyle="1" w:styleId="CharTok" w:type="character">
+    <w:name w:val="CharTok"/>
+    <w:basedOn w:val="VerbatimChar"/>
+    <w:rPr>
+      <w:color w:val="4070a0"/>
+    </w:rPr>
+  </w:style>
+  <w:style w:customStyle="1" w:styleId="SpecialCharTok" w:type="character">
+    <w:name w:val="SpecialCharTok"/>
+    <w:basedOn w:val="VerbatimChar"/>
+    <w:rPr>
+      <w:color w:val="4070a0"/>
+    </w:rPr>
+  </w:style>
+  <w:style w:customStyle="1" w:styleId="StringTok" w:type="character">
+    <w:name w:val="StringTok"/>
+    <w:basedOn w:val="VerbatimChar"/>
+    <w:rPr>
+      <w:color w:val="4070a0"/>
+    </w:rPr>
+  </w:style>
+  <w:style w:customStyle="1" w:styleId="VerbatimStringTok" w:type="character">
+    <w:name w:val="VerbatimStringTok"/>
+    <w:basedOn w:val="VerbatimChar"/>
+    <w:rPr>
+      <w:color w:val="4070a0"/>
+    </w:rPr>
+  </w:style>
+  <w:style w:customStyle="1" w:styleId="SpecialStringTok" w:type="character">
+    <w:name w:val="SpecialStringTok"/>
+    <w:basedOn w:val="VerbatimChar"/>
+    <w:rPr>
+      <w:color w:val="bb6688"/>
+    </w:rPr>
+  </w:style>
+  <w:style w:customStyle="1" w:styleId="ImportTok" w:type="character">
+    <w:name w:val="ImportTok"/>
+    <w:basedOn w:val="VerbatimChar"/>
+    <w:rPr>
+      <w:b/>
+      <w:color w:val="008000"/>
+    </w:rPr>
+  </w:style>
+  <w:style w:customStyle="1" w:styleId="CommentTok" w:type="character">
+    <w:name w:val="CommentTok"/>
+    <w:basedOn w:val="VerbatimChar"/>
+    <w:rPr>
+      <w:i/>
+      <w:color w:val="60a0b0"/>
+    </w:rPr>
+  </w:style>
+  <w:style w:customStyle="1" w:styleId="DocumentationTok" w:type="character">
+    <w:name w:val="DocumentationTok"/>
+    <w:basedOn w:val="VerbatimChar"/>
+    <w:rPr>
+      <w:i/>
+      <w:color w:val="ba2121"/>
+    </w:rPr>
+  </w:style>
+  <w:style w:customStyle="1" w:styleId="AnnotationTok" w:type="character">
+    <w:name w:val="AnnotationTok"/>
+    <w:basedOn w:val="VerbatimChar"/>
+    <w:rPr>
+      <w:b/>
+      <w:i/>
+      <w:color w:val="60a0b0"/>
+    </w:rPr>
+  </w:style>
+  <w:style w:customStyle="1" w:styleId="CommentVarTok" w:type="character">
+    <w:name w:val="CommentVarTok"/>
+    <w:basedOn w:val="VerbatimChar"/>
+    <w:rPr>
+      <w:b/>
+      <w:i/>
+      <w:color w:val="60a0b0"/>
+    </w:rPr>
+  </w:style>
+  <w:style w:customStyle="1" w:styleId="OtherTok" w:type="character">
+    <w:name w:val="OtherTok"/>
+    <w:basedOn w:val="VerbatimChar"/>
+    <w:rPr>
+      <w:color w:val="007020"/>
+    </w:rPr>
+  </w:style>
+  <w:style w:customStyle="1" w:styleId="FunctionTok" w:type="character">
+    <w:name w:val="FunctionTok"/>
+    <w:basedOn w:val="VerbatimChar"/>
+    <w:rPr>
+      <w:color w:val="06287e"/>
+    </w:rPr>
+  </w:style>
+  <w:style w:customStyle="1" w:styleId="VariableTok" w:type="character">
+    <w:name w:val="VariableTok"/>
+    <w:basedOn w:val="VerbatimChar"/>
+    <w:rPr>
+      <w:color w:val="19177c"/>
+    </w:rPr>
+  </w:style>
+  <w:style w:customStyle="1" w:styleId="ControlFlowTok" w:type="character">
+    <w:name w:val="ControlFlowTok"/>
+    <w:basedOn w:val="VerbatimChar"/>
+    <w:rPr>
+      <w:b/>
+      <w:color w:val="007020"/>
+    </w:rPr>
+  </w:style>
+  <w:style w:customStyle="1" w:styleId="OperatorTok" w:type="character">
+    <w:name w:val="OperatorTok"/>
+    <w:basedOn w:val="VerbatimChar"/>
+    <w:rPr>
+      <w:color w:val="666666"/>
+    </w:rPr>
+  </w:style>
+  <w:style w:customStyle="1" w:styleId="BuiltInTok" w:type="character">
+    <w:name w:val="BuiltInTok"/>
+    <w:basedOn w:val="VerbatimChar"/>
+    <w:rPr>
+      <w:color w:val="008000"/>
+    </w:rPr>
+  </w:style>
+  <w:style w:customStyle="1" w:styleId="ExtensionTok" w:type="character">
+    <w:name w:val="ExtensionTok"/>
+    <w:basedOn w:val="VerbatimChar"/>
+    <w:rPr/>
+  </w:style>
+  <w:style w:customStyle="1" w:styleId="PreprocessorTok" w:type="character">
+    <w:name w:val="PreprocessorTok"/>
+    <w:basedOn w:val="VerbatimChar"/>
+    <w:rPr>
+      <w:color w:val="bc7a00"/>
+    </w:rPr>
+  </w:style>
+  <w:style w:customStyle="1" w:styleId="AttributeTok" w:type="character">
+    <w:name w:val="AttributeTok"/>
+    <w:basedOn w:val="VerbatimChar"/>
+    <w:rPr>
+      <w:color w:val="7d9029"/>
+    </w:rPr>
+  </w:style>
+  <w:style w:customStyle="1" w:styleId="RegionMarkerTok" w:type="character">
+    <w:name w:val="RegionMarkerTok"/>
+    <w:basedOn w:val="VerbatimChar"/>
+    <w:rPr/>
+  </w:style>
+  <w:style w:customStyle="1" w:styleId="InformationTok" w:type="character">
+    <w:name w:val="InformationTok"/>
+    <w:basedOn w:val="VerbatimChar"/>
+    <w:rPr>
+      <w:b/>
+      <w:i/>
+      <w:color w:val="60a0b0"/>
+    </w:rPr>
+  </w:style>
+  <w:style w:customStyle="1" w:styleId="WarningTok" w:type="character">
+    <w:name w:val="WarningTok"/>
+    <w:basedOn w:val="VerbatimChar"/>
+    <w:rPr>
+      <w:b/>
+      <w:i/>
+      <w:color w:val="60a0b0"/>
+    </w:rPr>
+  </w:style>
+  <w:style w:customStyle="1" w:styleId="AlertTok" w:type="character">
+    <w:name w:val="AlertTok"/>
+    <w:basedOn w:val="VerbatimChar"/>
+    <w:rPr>
+      <w:b/>
+      <w:color w:val="ff0000"/>
+    </w:rPr>
+  </w:style>
+  <w:style w:customStyle="1" w:styleId="ErrorTok" w:type="character">
+    <w:name w:val="ErrorTok"/>
+    <w:basedOn w:val="VerbatimChar"/>
+    <w:rPr>
+      <w:b/>
+      <w:color w:val="ff0000"/>
+    </w:rPr>
+  </w:style>
+  <w:style w:customStyle="1" w:styleId="NormalTok" w:type="character">
+    <w:name w:val="NormalTok"/>
+    <w:basedOn w:val="VerbatimChar"/>
+    <w:rPr/>
   </w:style>
   <w:style w:type="character" w:customStyle="1" w:styleId="KeywordTok">
     <w:name w:val="KeywordTok"/>

</xml_diff>